<commit_message>
perf(docs): compress embedded screenshots to optimize docx report size under 2048 KB
</commit_message>
<xml_diff>
--- a/Week3_Troubleshooting_and_Bug_Report.docx
+++ b/Week3_Troubleshooting_and_Bug_Report.docx
@@ -546,7 +546,7 @@
                     <a:graphicData uri="http://schemas.openxmlformats.org/drawingml/2006/picture">
                       <pic:pic>
                         <pic:nvPicPr>
-                          <pic:cNvPr id="0" name="06_workout_tracker_live.png"/>
+                          <pic:cNvPr id="0" name="image.jpg"/>
                           <pic:cNvPicPr/>
                         </pic:nvPicPr>
                         <pic:blipFill>
@@ -613,7 +613,7 @@
                     <a:graphicData uri="http://schemas.openxmlformats.org/drawingml/2006/picture">
                       <pic:pic>
                         <pic:nvPicPr>
-                          <pic:cNvPr id="0" name="07_workout_add_set_modal.png"/>
+                          <pic:cNvPr id="0" name="image.jpg"/>
                           <pic:cNvPicPr/>
                         </pic:nvPicPr>
                         <pic:blipFill>
@@ -817,7 +817,7 @@
                     <a:graphicData uri="http://schemas.openxmlformats.org/drawingml/2006/picture">
                       <pic:pic>
                         <pic:nvPicPr>
-                          <pic:cNvPr id="0" name="11_habit_forge_modal.png"/>
+                          <pic:cNvPr id="0" name="image.jpg"/>
                           <pic:cNvPicPr/>
                         </pic:nvPicPr>
                         <pic:blipFill>
@@ -884,7 +884,7 @@
                     <a:graphicData uri="http://schemas.openxmlformats.org/drawingml/2006/picture">
                       <pic:pic>
                         <pic:nvPicPr>
-                          <pic:cNvPr id="0" name="12_habit_validation_error.png"/>
+                          <pic:cNvPr id="0" name="image.jpg"/>
                           <pic:cNvPicPr/>
                         </pic:nvPicPr>
                         <pic:blipFill>
@@ -1086,7 +1086,7 @@
                     <a:graphicData uri="http://schemas.openxmlformats.org/drawingml/2006/picture">
                       <pic:pic>
                         <pic:nvPicPr>
-                          <pic:cNvPr id="0" name="04_meal_logger_modal.png"/>
+                          <pic:cNvPr id="0" name="image.jpg"/>
                           <pic:cNvPicPr/>
                         </pic:nvPicPr>
                         <pic:blipFill>
@@ -1153,7 +1153,7 @@
                     <a:graphicData uri="http://schemas.openxmlformats.org/drawingml/2006/picture">
                       <pic:pic>
                         <pic:nvPicPr>
-                          <pic:cNvPr id="0" name="05_meal_validation_error.png"/>
+                          <pic:cNvPr id="0" name="image.jpg"/>
                           <pic:cNvPicPr/>
                         </pic:nvPicPr>
                         <pic:blipFill>
@@ -1344,7 +1344,7 @@
                     <a:graphicData uri="http://schemas.openxmlformats.org/drawingml/2006/picture">
                       <pic:pic>
                         <pic:nvPicPr>
-                          <pic:cNvPr id="0" name="15_1rm_calculator_modal.png"/>
+                          <pic:cNvPr id="0" name="image.jpg"/>
                           <pic:cNvPicPr/>
                         </pic:nvPicPr>
                         <pic:blipFill>
@@ -1411,7 +1411,7 @@
                     <a:graphicData uri="http://schemas.openxmlformats.org/drawingml/2006/picture">
                       <pic:pic>
                         <pic:nvPicPr>
-                          <pic:cNvPr id="0" name="16_1rm_saved_pr_snackbar.png"/>
+                          <pic:cNvPr id="0" name="image.jpg"/>
                           <pic:cNvPicPr/>
                         </pic:nvPicPr>
                         <pic:blipFill>
@@ -1607,7 +1607,7 @@
                     <a:graphicData uri="http://schemas.openxmlformats.org/drawingml/2006/picture">
                       <pic:pic>
                         <pic:nvPicPr>
-                          <pic:cNvPr id="0" name="02_readiness_modal.png"/>
+                          <pic:cNvPr id="0" name="image.jpg"/>
                           <pic:cNvPicPr/>
                         </pic:nvPicPr>
                         <pic:blipFill>
@@ -1674,7 +1674,7 @@
                     <a:graphicData uri="http://schemas.openxmlformats.org/drawingml/2006/picture">
                       <pic:pic>
                         <pic:nvPicPr>
-                          <pic:cNvPr id="0" name="02_readiness_calculated.png"/>
+                          <pic:cNvPr id="0" name="image.jpg"/>
                           <pic:cNvPicPr/>
                         </pic:nvPicPr>
                         <pic:blipFill>
@@ -2372,7 +2372,7 @@
                     <a:graphicData uri="http://schemas.openxmlformats.org/drawingml/2006/picture">
                       <pic:pic>
                         <pic:nvPicPr>
-                          <pic:cNvPr id="0" name="03_dashboard_macros.png"/>
+                          <pic:cNvPr id="0" name="image.jpg"/>
                           <pic:cNvPicPr/>
                         </pic:nvPicPr>
                         <pic:blipFill>
@@ -2439,7 +2439,7 @@
                     <a:graphicData uri="http://schemas.openxmlformats.org/drawingml/2006/picture">
                       <pic:pic>
                         <pic:nvPicPr>
-                          <pic:cNvPr id="0" name="03_dashboard_macros_fixed.png"/>
+                          <pic:cNvPr id="0" name="image.jpg"/>
                           <pic:cNvPicPr/>
                         </pic:nvPicPr>
                         <pic:blipFill>
@@ -2680,7 +2680,7 @@
                     <a:graphicData uri="http://schemas.openxmlformats.org/drawingml/2006/picture">
                       <pic:pic>
                         <pic:nvPicPr>
-                          <pic:cNvPr id="0" name="14_analytics_1rm_card.png"/>
+                          <pic:cNvPr id="0" name="image.jpg"/>
                           <pic:cNvPicPr/>
                         </pic:nvPicPr>
                         <pic:blipFill>
@@ -2747,7 +2747,7 @@
                     <a:graphicData uri="http://schemas.openxmlformats.org/drawingml/2006/picture">
                       <pic:pic>
                         <pic:nvPicPr>
-                          <pic:cNvPr id="0" name="14_analytics_pr_cards_fixed.png"/>
+                          <pic:cNvPr id="0" name="image.jpg"/>
                           <pic:cNvPicPr/>
                         </pic:nvPicPr>
                         <pic:blipFill>

</xml_diff>